<commit_message>
addressed editorial comments and added cover letter
</commit_message>
<xml_diff>
--- a/manuscript/Table_2_trial_selection.docx
+++ b/manuscript/Table_2_trial_selection.docx
@@ -2,6 +2,56 @@
 <file path=word/document.xml><?xml version="1.0" encoding="utf-8"?>
 <w:document xmlns:w="http://schemas.openxmlformats.org/wordprocessingml/2006/main" xmlns:m="http://schemas.openxmlformats.org/officeDocument/2006/math" xmlns:r="http://schemas.openxmlformats.org/officeDocument/2006/relationships" xmlns:o="urn:schemas-microsoft-com:office:office" xmlns:v="urn:schemas-microsoft-com:vml" xmlns:w10="urn:schemas-microsoft-com:office:word" xmlns:a="http://schemas.openxmlformats.org/drawingml/2006/main" xmlns:pic="http://schemas.openxmlformats.org/drawingml/2006/picture" xmlns:wp="http://schemas.openxmlformats.org/drawingml/2006/wordprocessingDrawing">
   <w:body>
+    <w:p>
+      <w:pPr>
+        <w:spacing w:before="0" w:after="60"/>
+        <w:keepNext/>
+        <w:jc w:val="start"/>
+        <w:pStyle w:val="caption"/>
+      </w:pPr>
+      <w:r>
+        <w:rPr>
+          <w:rFonts w:ascii="Calibri" w:hAnsi="Calibri"/>
+          <w:sz w:val="24"/>
+        </w:rPr>
+        <w:t xml:space="preserve">Table </w:t>
+      </w:r>
+      <w:r>
+        <w:fldChar w:fldCharType="begin" w:dirty="true"/>
+      </w:r>
+      <w:r>
+        <w:instrText xml:space="preserve" w:dirty="true"> SEQ Table \* ARABIC </w:instrText>
+      </w:r>
+      <w:r>
+        <w:fldChar w:fldCharType="separate" w:dirty="true"/>
+      </w:r>
+      <w:r>
+        <w:rPr>
+          <w:noProof/>
+          <w:rFonts w:ascii="Calibri" w:hAnsi="Calibri"/>
+          <w:sz w:val="24"/>
+        </w:rPr>
+        <w:t xml:space="default">1</w:t>
+      </w:r>
+      <w:r>
+        <w:fldChar w:fldCharType="end" w:dirty="true"/>
+      </w:r>
+      <w:r>
+        <w:rPr>
+          <w:rFonts w:ascii="Calibri" w:hAnsi="Calibri"/>
+          <w:sz w:val="24"/>
+        </w:rPr>
+        <w:t xml:space="preserve">: </w:t>
+      </w:r>
+      <w:r>
+        <w:rPr>
+          <w:rFonts w:ascii="Calibri" w:hAnsi="Calibri"/>
+          <w:sz w:val="24"/>
+          <w:color w:val="333333"/>
+        </w:rPr>
+        <w:t xml:space="default">Tentative list of randomized controlled trials (RCTs) considered for emulation.</w:t>
+      </w:r>
+    </w:p>
     <w:tbl xmlns:w="http://schemas.openxmlformats.org/wordprocessingml/2006/main" xmlns:wp="http://schemas.openxmlformats.org/drawingml/2006/wordprocessingDrawing" xmlns:r="http://schemas.openxmlformats.org/officeDocument/2006/relationships" xmlns:w14="http://schemas.microsoft.com/office/word/2010/wordml">
       <w:tblPr>
         <w:tblCellMar>

</xml_diff>